<commit_message>
Add and update codes
</commit_message>
<xml_diff>
--- a/public/resume.docx
+++ b/public/resume.docx
@@ -23,9 +23,6 @@
       <w:pPr>
         <w:spacing w:after="40"/>
         <w:jc w:val="center"/>
-        <w:rPr>
-          <w:lang w:val="fr-FR"/>
-        </w:rPr>
       </w:pPr>
       <w:r>
         <w:rPr>
@@ -33,7 +30,6 @@
           <w:color w:val="333333"/>
           <w:sz w:val="19"/>
           <w:szCs w:val="19"/>
-          <w:lang w:val="fr-FR"/>
         </w:rPr>
         <w:t>Moncton, NB  • [ 416-823-5690]  •  sunesh@sps.com.np</w:t>
       </w:r>
@@ -617,7 +613,16 @@
           <w:iCs/>
           <w:color w:val="555555"/>
         </w:rPr>
-        <w:t>Tim Hortons, Toronto, ON</w:t>
+        <w:t xml:space="preserve">Tim Hortons, </w:t>
+      </w:r>
+      <w:r>
+        <w:rPr>
+          <w:rFonts w:ascii="Calibri" w:eastAsia="Calibri" w:hAnsi="Calibri" w:cs="Calibri"/>
+          <w:i/>
+          <w:iCs/>
+          <w:color w:val="555555"/>
+        </w:rPr>
+        <w:t>Sussex, NB</w:t>
       </w:r>
     </w:p>
     <w:p>

</xml_diff>